<commit_message>
feat: document 2025 CPL season review, update 2026 data, and enhance prediction engine priors and simulation state.
</commit_message>
<xml_diff>
--- a/power-rankings-explained.docx
+++ b/power-rankings-explained.docx
@@ -1167,6 +1167,118 @@
           <w:color w:val="0F172A"/>
           <w:sz w:val="17"/>
         </w:rPr>
+        <w:t xml:space="preserve">Where a season starts.</w:t>
+      </w:r>
+      <w:r>
+        <w:rPr>
+          <w:rFonts w:ascii="Helvetica" w:hAnsi="Helvetica"/>
+          <w:color w:val="1E293B"/>
+          <w:sz w:val="17"/>
+        </w:rPr>
+        <w:t xml:space="preserve"> On the morning of the first match there are no results to grade, so every subject sits at its neutral mark and all seven teams score an identical 34.0 — which would say the reigning champions and the bottom side are the same team. They are not. Each team therefore </w:t>
+      </w:r>
+      <w:r>
+        <w:rPr>
+          <w:rFonts w:ascii="Helvetica" w:hAnsi="Helvetica"/>
+          <w:b/>
+          <w:color w:val="0F172A"/>
+          <w:sz w:val="17"/>
+        </w:rPr>
+        <w:t xml:space="preserve">opens on the rating it earned last season</w:t>
+      </w:r>
+      <w:r>
+        <w:rPr>
+          <w:rFonts w:ascii="Helvetica" w:hAnsi="Helvetica"/>
+          <w:color w:val="1E293B"/>
+          <w:sz w:val="17"/>
+        </w:rPr>
+        <w:t xml:space="preserve">, computed by running this same method over the completed 2025 season, and that inherited rating is then worth less with every match actually played this year: half of it is gone after four games, roughly three-quarters after twelve, and by the back end of a season the table is entirely 2026 form. Jamaica Kingsmen are new and have no 2025 record to inherit, so they open one standard deviation below the 2025 league average — a first-year discount that is stated rather than hidden. Press </w:t>
+      </w:r>
+      <w:r>
+        <w:rPr>
+          <w:rFonts w:ascii="Helvetica" w:hAnsi="Helvetica"/>
+          <w:b/>
+          <w:color w:val="0F172A"/>
+          <w:sz w:val="17"/>
+        </w:rPr>
+        <w:t xml:space="preserve">Fresh Start</w:t>
+      </w:r>
+      <w:r>
+        <w:rPr>
+          <w:rFonts w:ascii="Helvetica" w:hAnsi="Helvetica"/>
+          <w:color w:val="1E293B"/>
+          <w:sz w:val="17"/>
+        </w:rPr>
+        <w:t xml:space="preserve"> to switch the carry-in off and rank on this season alone.</w:t>
+      </w:r>
+    </w:p>
+    <w:p>
+      <w:pPr>
+        <w:spacing w:before="0" w:after="70" w:line="326" w:lineRule="auto"/>
+      </w:pPr>
+      <w:r>
+        <w:rPr>
+          <w:rFonts w:ascii="Helvetica" w:hAnsi="Helvetica"/>
+          <w:b/>
+          <w:color w:val="0F172A"/>
+          <w:sz w:val="17"/>
+        </w:rPr>
+        <w:t xml:space="preserve">How much last season is trusted.</w:t>
+      </w:r>
+      <w:r>
+        <w:rPr>
+          <w:rFonts w:ascii="Helvetica" w:hAnsi="Helvetica"/>
+          <w:color w:val="1E293B"/>
+          <w:sz w:val="17"/>
+        </w:rPr>
+        <w:t xml:space="preserve"> A record describes the squad that produced it, and these squads changed a great deal over the winter — Saint Lucia kept barely a third of theirs, Barbados two thirds. A team that has largely been rebuilt is therefore held closer to the league average than one that kept its side together: last season still counts, but it counts less when fewer of the players are still there. Note what this is and is not. It measures </w:t>
+      </w:r>
+      <w:r>
+        <w:rPr>
+          <w:rFonts w:ascii="Helvetica" w:hAnsi="Helvetica"/>
+          <w:i/>
+          <w:color w:val="1E293B"/>
+          <w:sz w:val="17"/>
+        </w:rPr>
+        <w:t xml:space="preserve">how much we know</w:t>
+      </w:r>
+      <w:r>
+        <w:rPr>
+          <w:rFonts w:ascii="Helvetica" w:hAnsi="Helvetica"/>
+          <w:color w:val="1E293B"/>
+          <w:sz w:val="17"/>
+        </w:rPr>
+        <w:t xml:space="preserve">, not </w:t>
+      </w:r>
+      <w:r>
+        <w:rPr>
+          <w:rFonts w:ascii="Helvetica" w:hAnsi="Helvetica"/>
+          <w:i/>
+          <w:color w:val="1E293B"/>
+          <w:sz w:val="17"/>
+        </w:rPr>
+        <w:t xml:space="preserve">how good the new squad is</w:t>
+      </w:r>
+      <w:r>
+        <w:rPr>
+          <w:rFonts w:ascii="Helvetica" w:hAnsi="Helvetica"/>
+          <w:color w:val="1E293B"/>
+          <w:sz w:val="17"/>
+        </w:rPr>
+        <w:t xml:space="preserve"> — so a weak side that rebuilt also moves toward the middle, because its poor record has stopped being reliable evidence too.</w:t>
+      </w:r>
+    </w:p>
+    <w:p>
+      <w:pPr>
+        <w:spacing w:before="0" w:after="70" w:line="326" w:lineRule="auto"/>
+      </w:pPr>
+      <w:r>
+        <w:rPr>
+          <w:rFonts w:ascii="Helvetica" w:hAnsi="Helvetica"/>
+          <w:b/>
+          <w:color w:val="0F172A"/>
+          <w:sz w:val="17"/>
+        </w:rPr>
         <w:t xml:space="preserve">The score and the arrows.</w:t>
       </w:r>
       <w:r>
@@ -2178,6 +2290,445 @@
     </w:p>
     <w:p>
       <w:pPr>
+        <w:spacing w:before="180" w:after="90" w:line="326" w:lineRule="auto"/>
+      </w:pPr>
+      <w:r>
+        <w:rPr>
+          <w:rFonts w:ascii="Helvetica" w:hAnsi="Helvetica"/>
+          <w:b/>
+          <w:color w:val="0F172A"/>
+          <w:sz w:val="18"/>
+        </w:rPr>
+        <w:t xml:space="preserve">Season carry-in (the prior)</w:t>
+      </w:r>
+    </w:p>
+    <w:p>
+      <w:pPr>
+        <w:spacing w:before="0" w:after="70" w:line="326" w:lineRule="auto"/>
+      </w:pPr>
+      <w:r>
+        <w:rPr>
+          <w:rFonts w:ascii="Helvetica" w:hAnsi="Helvetica"/>
+          <w:color w:val="1E293B"/>
+          <w:sz w:val="17"/>
+        </w:rPr>
+        <w:t xml:space="preserve">With no matches played, every normalised metric falls to its neutral value and the weighted sum is identically </w:t>
+      </w:r>
+      <w:r>
+        <w:rPr>
+          <w:rFonts w:ascii="Consolas" w:hAnsi="Consolas"/>
+          <w:color w:val="1E293B"/>
+          <w:sz w:val="16"/>
+          <w:shd w:val="clear" w:fill="F1F5F9"/>
+        </w:rPr>
+        <w:t xml:space="preserve">34.0</w:t>
+      </w:r>
+      <w:r>
+        <w:rPr>
+          <w:rFonts w:ascii="Helvetica" w:hAnsi="Helvetica"/>
+          <w:color w:val="1E293B"/>
+          <w:sz w:val="17"/>
+        </w:rPr>
+        <w:t xml:space="preserve"> for every team. Ranking a new season from that point discards the only evidence that exists. So each team opens on the index it earned in the previous season and that opening claim decays as real results arrive:</w:t>
+      </w:r>
+    </w:p>
+    <w:p>
+      <w:pPr>
+        <w:pBdr>
+          <w:left w:val="single" w:sz="18" w:space="4" w:color="2563EB"/>
+        </w:pBdr>
+        <w:spacing w:before="0" w:after="70" w:line="326" w:lineRule="auto"/>
+        <w:ind w:left="120"/>
+      </w:pPr>
+      <w:r>
+        <w:rPr>
+          <w:rFonts w:ascii="Consolas" w:hAnsi="Consolas"/>
+          <w:color w:val="1E293B"/>
+          <w:sz w:val="14"/>
+          <w:shd w:val="clear" w:fill="F1F5F9"/>
+        </w:rPr>
+        <w:t xml:space="preserve">prior_weight = k / (k + played)          k = prior.halfLifeMatches (default 4)  score        = prior_weight · prior + (1 − prior_weight) · thisSeasonIndex</w:t>
+      </w:r>
+    </w:p>
+    <w:p>
+      <w:pPr>
+        <w:spacing w:before="0" w:after="70" w:line="326" w:lineRule="auto"/>
+      </w:pPr>
+      <w:r>
+        <w:rPr>
+          <w:rFonts w:ascii="Helvetica" w:hAnsi="Helvetica"/>
+          <w:color w:val="1E293B"/>
+          <w:sz w:val="17"/>
+        </w:rPr>
+        <w:t xml:space="preserve">At </w:t>
+      </w:r>
+      <w:r>
+        <w:rPr>
+          <w:rFonts w:ascii="Consolas" w:hAnsi="Consolas"/>
+          <w:color w:val="1E293B"/>
+          <w:sz w:val="16"/>
+          <w:shd w:val="clear" w:fill="F1F5F9"/>
+        </w:rPr>
+        <w:t xml:space="preserve">played = 0</w:t>
+      </w:r>
+      <w:r>
+        <w:rPr>
+          <w:rFonts w:ascii="Helvetica" w:hAnsi="Helvetica"/>
+          <w:color w:val="1E293B"/>
+          <w:sz w:val="17"/>
+        </w:rPr>
+        <w:t xml:space="preserve"> the weight is exactly 1, so the published rating </w:t>
+      </w:r>
+      <w:r>
+        <w:rPr>
+          <w:rFonts w:ascii="Helvetica" w:hAnsi="Helvetica"/>
+          <w:b/>
+          <w:color w:val="0F172A"/>
+          <w:sz w:val="17"/>
+        </w:rPr>
+        <w:t xml:space="preserve">is</w:t>
+      </w:r>
+      <w:r>
+        <w:rPr>
+          <w:rFonts w:ascii="Helvetica" w:hAnsi="Helvetica"/>
+          <w:color w:val="1E293B"/>
+          <w:sz w:val="17"/>
+        </w:rPr>
+        <w:t xml:space="preserve"> last season's index; at </w:t>
+      </w:r>
+      <w:r>
+        <w:rPr>
+          <w:rFonts w:ascii="Consolas" w:hAnsi="Consolas"/>
+          <w:color w:val="1E293B"/>
+          <w:sz w:val="16"/>
+          <w:shd w:val="clear" w:fill="F1F5F9"/>
+        </w:rPr>
+        <w:t xml:space="preserve">played = k</w:t>
+      </w:r>
+      <w:r>
+        <w:rPr>
+          <w:rFonts w:ascii="Helvetica" w:hAnsi="Helvetica"/>
+          <w:color w:val="1E293B"/>
+          <w:sz w:val="17"/>
+        </w:rPr>
+        <w:t xml:space="preserve"> the prior carries half; at ten matches about 29%. The unblended in-season index stays on every row (</w:t>
+      </w:r>
+      <w:r>
+        <w:rPr>
+          <w:rFonts w:ascii="Consolas" w:hAnsi="Consolas"/>
+          <w:color w:val="1E293B"/>
+          <w:sz w:val="16"/>
+          <w:shd w:val="clear" w:fill="F1F5F9"/>
+        </w:rPr>
+        <w:t xml:space="preserve">inSeasonScore</w:t>
+      </w:r>
+      <w:r>
+        <w:rPr>
+          <w:rFonts w:ascii="Helvetica" w:hAnsi="Helvetica"/>
+          <w:color w:val="1E293B"/>
+          <w:sz w:val="17"/>
+        </w:rPr>
+        <w:t xml:space="preserve">) so an audit can always see what this season alone says.</w:t>
+      </w:r>
+    </w:p>
+    <w:p>
+      <w:pPr>
+        <w:spacing w:before="0" w:after="70" w:line="326" w:lineRule="auto"/>
+      </w:pPr>
+      <w:r>
+        <w:rPr>
+          <w:rFonts w:ascii="Helvetica" w:hAnsi="Helvetica"/>
+          <w:b/>
+          <w:color w:val="0F172A"/>
+          <w:sz w:val="17"/>
+        </w:rPr>
+        <w:t xml:space="preserve">Squad continuity.</w:t>
+      </w:r>
+      <w:r>
+        <w:rPr>
+          <w:rFonts w:ascii="Helvetica" w:hAnsi="Helvetica"/>
+          <w:color w:val="1E293B"/>
+          <w:sz w:val="17"/>
+        </w:rPr>
+        <w:t xml:space="preserve"> A record only describes the squad that produced it. Between 2025 and 2026, 23 players switched franchise and 33 left the league, and it fell unevenly — Saint Lucia kept 39% of their squad, Barbados 67%. So each prior is pulled toward the league mean in proportion to how much of the side is gone:</w:t>
+      </w:r>
+    </w:p>
+    <w:p>
+      <w:pPr>
+        <w:pBdr>
+          <w:left w:val="single" w:sz="18" w:space="4" w:color="2563EB"/>
+        </w:pBdr>
+        <w:spacing w:before="0" w:after="70" w:line="326" w:lineRule="auto"/>
+        <w:ind w:left="120"/>
+      </w:pPr>
+      <w:r>
+        <w:rPr>
+          <w:rFonts w:ascii="Consolas" w:hAnsi="Consolas"/>
+          <w:color w:val="1E293B"/>
+          <w:sz w:val="14"/>
+          <w:shd w:val="clear" w:fill="F1F5F9"/>
+        </w:rPr>
+        <w:t xml:space="preserve">λ      = confidenceFloor + (1 − confidenceFloor) · kept / squad2025  prior' = leagueMean + λ · (prior − leagueMean)</w:t>
+      </w:r>
+    </w:p>
+    <w:p>
+      <w:pPr>
+        <w:spacing w:before="0" w:after="70" w:line="326" w:lineRule="auto"/>
+      </w:pPr>
+      <w:r>
+        <w:rPr>
+          <w:rFonts w:ascii="Helvetica" w:hAnsi="Helvetica"/>
+          <w:color w:val="1E293B"/>
+          <w:sz w:val="17"/>
+        </w:rPr>
+        <w:t xml:space="preserve">with </w:t>
+      </w:r>
+      <w:r>
+        <w:rPr>
+          <w:rFonts w:ascii="Consolas" w:hAnsi="Consolas"/>
+          <w:color w:val="1E293B"/>
+          <w:sz w:val="16"/>
+          <w:shd w:val="clear" w:fill="F1F5F9"/>
+        </w:rPr>
+        <w:t xml:space="preserve">confidenceFloor = 0.5</w:t>
+      </w:r>
+      <w:r>
+        <w:rPr>
+          <w:rFonts w:ascii="Helvetica" w:hAnsi="Helvetica"/>
+          <w:color w:val="1E293B"/>
+          <w:sz w:val="17"/>
+        </w:rPr>
+        <w:t xml:space="preserve">, so even a fully rebuilt squad keeps half its distance from the mean — coaching, conditions and a core identity carry over. Per-team counts live in </w:t>
+      </w:r>
+      <w:r>
+        <w:rPr>
+          <w:rFonts w:ascii="Consolas" w:hAnsi="Consolas"/>
+          <w:color w:val="1E293B"/>
+          <w:sz w:val="16"/>
+          <w:shd w:val="clear" w:fill="F1F5F9"/>
+        </w:rPr>
+        <w:t xml:space="preserve">data/cpl_2026.json → squadMovement</w:t>
+      </w:r>
+      <w:r>
+        <w:rPr>
+          <w:rFonts w:ascii="Helvetica" w:hAnsi="Helvetica"/>
+          <w:color w:val="1E293B"/>
+          <w:sz w:val="17"/>
+        </w:rPr>
+        <w:t xml:space="preserve">, taken from the season review's movement tables, and reconcile exactly with its published totals.</w:t>
+      </w:r>
+    </w:p>
+    <w:p>
+      <w:pPr>
+        <w:spacing w:before="0" w:after="70" w:line="326" w:lineRule="auto"/>
+      </w:pPr>
+      <w:r>
+        <w:rPr>
+          <w:rFonts w:ascii="Helvetica" w:hAnsi="Helvetica"/>
+          <w:color w:val="1E293B"/>
+          <w:sz w:val="17"/>
+        </w:rPr>
+        <w:t xml:space="preserve">This is </w:t>
+      </w:r>
+      <w:r>
+        <w:rPr>
+          <w:rFonts w:ascii="Helvetica" w:hAnsi="Helvetica"/>
+          <w:b/>
+          <w:color w:val="0F172A"/>
+          <w:sz w:val="17"/>
+        </w:rPr>
+        <w:t xml:space="preserve">uncertainty, not punishment</w:t>
+      </w:r>
+      <w:r>
+        <w:rPr>
+          <w:rFonts w:ascii="Helvetica" w:hAnsi="Helvetica"/>
+          <w:color w:val="1E293B"/>
+          <w:sz w:val="17"/>
+        </w:rPr>
+        <w:t xml:space="preserve">, and the direction follows from that: heavy churn makes a </w:t>
+      </w:r>
+      <w:r>
+        <w:rPr>
+          <w:rFonts w:ascii="Helvetica" w:hAnsi="Helvetica"/>
+          <w:i/>
+          <w:color w:val="1E293B"/>
+          <w:sz w:val="17"/>
+        </w:rPr>
+        <w:t xml:space="preserve">bad</w:t>
+      </w:r>
+      <w:r>
+        <w:rPr>
+          <w:rFonts w:ascii="Helvetica" w:hAnsi="Helvetica"/>
+          <w:color w:val="1E293B"/>
+          <w:sz w:val="17"/>
+        </w:rPr>
+        <w:t xml:space="preserve"> record less predictive too, so a below-average side that rebuilt moves </w:t>
+      </w:r>
+      <w:r>
+        <w:rPr>
+          <w:rFonts w:ascii="Helvetica" w:hAnsi="Helvetica"/>
+          <w:i/>
+          <w:color w:val="1E293B"/>
+          <w:sz w:val="17"/>
+        </w:rPr>
+        <w:t xml:space="preserve">up</w:t>
+      </w:r>
+      <w:r>
+        <w:rPr>
+          <w:rFonts w:ascii="Helvetica" w:hAnsi="Helvetica"/>
+          <w:color w:val="1E293B"/>
+          <w:sz w:val="17"/>
+        </w:rPr>
+        <w:t xml:space="preserve"> toward the mean. Saint Lucia — most churned of the seven — gains slightly despite losing their captain and their leading spinner. Making churn actively cost a team would mean valuing the individual players who left, which is a judgement call, and the ordering is meant to be arithmetic. Teams with no previous season are skipped: Jamaica's standing is already set by the expansion rule.</w:t>
+      </w:r>
+    </w:p>
+    <w:p>
+      <w:pPr>
+        <w:spacing w:before="0" w:after="70" w:line="326" w:lineRule="auto"/>
+      </w:pPr>
+      <w:r>
+        <w:rPr>
+          <w:rFonts w:ascii="Helvetica" w:hAnsi="Helvetica"/>
+          <w:color w:val="1E293B"/>
+          <w:sz w:val="17"/>
+        </w:rPr>
+        <w:t xml:space="preserve">The prior is </w:t>
+      </w:r>
+      <w:r>
+        <w:rPr>
+          <w:rFonts w:ascii="Helvetica" w:hAnsi="Helvetica"/>
+          <w:b/>
+          <w:color w:val="0F172A"/>
+          <w:sz w:val="17"/>
+        </w:rPr>
+        <w:t xml:space="preserve">derived, not entered</w:t>
+      </w:r>
+      <w:r>
+        <w:rPr>
+          <w:rFonts w:ascii="Helvetica" w:hAnsi="Helvetica"/>
+          <w:color w:val="1E293B"/>
+          <w:sz w:val="17"/>
+        </w:rPr>
+        <w:t xml:space="preserve">: </w:t>
+      </w:r>
+      <w:r>
+        <w:rPr>
+          <w:rFonts w:ascii="Consolas" w:hAnsi="Consolas"/>
+          <w:color w:val="1E293B"/>
+          <w:sz w:val="16"/>
+          <w:shd w:val="clear" w:fill="F1F5F9"/>
+        </w:rPr>
+        <w:t xml:space="preserve">src/priors.js</w:t>
+      </w:r>
+      <w:r>
+        <w:rPr>
+          <w:rFonts w:ascii="Helvetica" w:hAnsi="Helvetica"/>
+          <w:color w:val="1E293B"/>
+          <w:sz w:val="17"/>
+        </w:rPr>
+        <w:t xml:space="preserve"> runs this same engine with these same weights over </w:t>
+      </w:r>
+      <w:r>
+        <w:rPr>
+          <w:rFonts w:ascii="Consolas" w:hAnsi="Consolas"/>
+          <w:color w:val="1E293B"/>
+          <w:sz w:val="16"/>
+          <w:shd w:val="clear" w:fill="F1F5F9"/>
+        </w:rPr>
+        <w:t xml:space="preserve">data/cpl_2025.json</w:t>
+      </w:r>
+      <w:r>
+        <w:rPr>
+          <w:rFonts w:ascii="Helvetica" w:hAnsi="Helvetica"/>
+          <w:color w:val="1E293B"/>
+          <w:sz w:val="17"/>
+        </w:rPr>
+        <w:t xml:space="preserve">, so re-tuning a weight moves the carry-in and the live table together. A rebranded franchise inherits its predecessor's index via </w:t>
+      </w:r>
+      <w:r>
+        <w:rPr>
+          <w:rFonts w:ascii="Consolas" w:hAnsi="Consolas"/>
+          <w:color w:val="1E293B"/>
+          <w:sz w:val="16"/>
+          <w:shd w:val="clear" w:fill="F1F5F9"/>
+        </w:rPr>
+        <w:t xml:space="preserve">priorFrom</w:t>
+      </w:r>
+      <w:r>
+        <w:rPr>
+          <w:rFonts w:ascii="Helvetica" w:hAnsi="Helvetica"/>
+          <w:color w:val="1E293B"/>
+          <w:sz w:val="17"/>
+        </w:rPr>
+        <w:t xml:space="preserve"> in the season data — Barbados Tridents carry Barbados Royals' 2025 season. A genuinely new franchise cannot be measured, so it opens </w:t>
+      </w:r>
+      <w:r>
+        <w:rPr>
+          <w:rFonts w:ascii="Consolas" w:hAnsi="Consolas"/>
+          <w:color w:val="1E293B"/>
+          <w:sz w:val="16"/>
+          <w:shd w:val="clear" w:fill="F1F5F9"/>
+        </w:rPr>
+        <w:t xml:space="preserve">prior.expansionSigma</w:t>
+      </w:r>
+      <w:r>
+        <w:rPr>
+          <w:rFonts w:ascii="Helvetica" w:hAnsi="Helvetica"/>
+          <w:color w:val="1E293B"/>
+          <w:sz w:val="17"/>
+        </w:rPr>
+        <w:t xml:space="preserve"> standard deviations below the previous league mean; at the default 1.0 that puts Jamaica Kingsmen sixth of seven.</w:t>
+      </w:r>
+    </w:p>
+    <w:p>
+      <w:pPr>
+        <w:spacing w:before="0" w:after="70" w:line="326" w:lineRule="auto"/>
+      </w:pPr>
+      <w:r>
+        <w:rPr>
+          <w:rFonts w:ascii="Helvetica" w:hAnsi="Helvetica"/>
+          <w:color w:val="1E293B"/>
+          <w:sz w:val="17"/>
+        </w:rPr>
+        <w:t xml:space="preserve">Two honest limits. The 2025 source carries no ball-by-ball data, so the powerplay and death-overs terms evaluate to exactly 0.5 for all six teams in the 2025 pass — they contribute an identical 13.5 points to every prior and therefore shift the scale but </w:t>
+      </w:r>
+      <w:r>
+        <w:rPr>
+          <w:rFonts w:ascii="Helvetica" w:hAnsi="Helvetica"/>
+          <w:b/>
+          <w:color w:val="0F172A"/>
+          <w:sz w:val="17"/>
+        </w:rPr>
+        <w:t xml:space="preserve">cannot change the 2025 order</w:t>
+      </w:r>
+      <w:r>
+        <w:rPr>
+          <w:rFonts w:ascii="Helvetica" w:hAnsi="Helvetica"/>
+          <w:color w:val="1E293B"/>
+          <w:sz w:val="17"/>
+        </w:rPr>
+        <w:t xml:space="preserve">. And the carry-in openly </w:t>
+      </w:r>
+      <w:r>
+        <w:rPr>
+          <w:rFonts w:ascii="Helvetica" w:hAnsi="Helvetica"/>
+          <w:i/>
+          <w:color w:val="1E293B"/>
+          <w:sz w:val="17"/>
+        </w:rPr>
+        <w:t xml:space="preserve">does</w:t>
+      </w:r>
+      <w:r>
+        <w:rPr>
+          <w:rFonts w:ascii="Helvetica" w:hAnsi="Helvetica"/>
+          <w:color w:val="1E293B"/>
+          <w:sz w:val="17"/>
+        </w:rPr>
+        <w:t xml:space="preserve"> change the published order; that is its purpose. Fresh Start turns it off.</w:t>
+      </w:r>
+    </w:p>
+    <w:p>
+      <w:pPr>
         <w:spacing w:before="0" w:after="70" w:line="326" w:lineRule="auto"/>
       </w:pPr>
       <w:r>
@@ -2521,7 +3072,75 @@
           <w:color w:val="1E293B"/>
           <w:sz w:val="17"/>
         </w:rPr>
-        <w:t xml:space="preserve"> is a supplied figure, not yet a live ICC top-30 feed, so it reflects whatever availability was entered.</w:t>
+        <w:t xml:space="preserve"> is a supplied figure, not yet a live ICC top-30 feed, so it reflects whatever availability was entered. It is also a </w:t>
+      </w:r>
+      <w:r>
+        <w:rPr>
+          <w:rFonts w:ascii="Helvetica" w:hAnsi="Helvetica"/>
+          <w:i/>
+          <w:color w:val="1E293B"/>
+          <w:sz w:val="17"/>
+        </w:rPr>
+        <w:t xml:space="preserve">ratio</w:t>
+      </w:r>
+      <w:r>
+        <w:rPr>
+          <w:rFonts w:ascii="Helvetica" w:hAnsi="Helvetica"/>
+          <w:color w:val="1E293B"/>
+          <w:sz w:val="17"/>
+        </w:rPr>
+        <w:t xml:space="preserve"> of available to squad stars, which means it is </w:t>
+      </w:r>
+      <w:r>
+        <w:rPr>
+          <w:rFonts w:ascii="Helvetica" w:hAnsi="Helvetica"/>
+          <w:b/>
+          <w:color w:val="0F172A"/>
+          <w:sz w:val="17"/>
+        </w:rPr>
+        <w:t xml:space="preserve">1.0 for everybody at the start of a season</w:t>
+      </w:r>
+      <w:r>
+        <w:rPr>
+          <w:rFonts w:ascii="Helvetica" w:hAnsi="Helvetica"/>
+          <w:color w:val="1E293B"/>
+          <w:sz w:val="17"/>
+        </w:rPr>
+        <w:t xml:space="preserve"> — the </w:t>
+      </w:r>
+      <w:r>
+        <w:rPr>
+          <w:rFonts w:ascii="Consolas" w:hAnsi="Consolas"/>
+          <w:color w:val="1E293B"/>
+          <w:sz w:val="16"/>
+          <w:shd w:val="clear" w:fill="F1F5F9"/>
+        </w:rPr>
+        <w:t xml:space="preserve">squadStars</w:t>
+      </w:r>
+      <w:r>
+        <w:rPr>
+          <w:rFonts w:ascii="Helvetica" w:hAnsi="Helvetica"/>
+          <w:color w:val="1E293B"/>
+          <w:sz w:val="17"/>
+        </w:rPr>
+        <w:t xml:space="preserve"> numbers change nothing on an opening table, and the term only does work once a match reports someone missing. Squad </w:t>
+      </w:r>
+      <w:r>
+        <w:rPr>
+          <w:rFonts w:ascii="Helvetica" w:hAnsi="Helvetica"/>
+          <w:i/>
+          <w:color w:val="1E293B"/>
+          <w:sz w:val="17"/>
+        </w:rPr>
+        <w:t xml:space="preserve">strength</w:t>
+      </w:r>
+      <w:r>
+        <w:rPr>
+          <w:rFonts w:ascii="Helvetica" w:hAnsi="Helvetica"/>
+          <w:color w:val="1E293B"/>
+          <w:sz w:val="17"/>
+        </w:rPr>
+        <w:t xml:space="preserve"> reaches the table through continuity instead.</w:t>
       </w:r>
     </w:p>
     <w:p>
@@ -2544,15 +3163,15 @@
           <w:color w:val="0F172A"/>
           <w:sz w:val="17"/>
         </w:rPr>
-        <w:t xml:space="preserve">T20-shaped.</w:t>
-      </w:r>
-      <w:r>
-        <w:rPr>
-          <w:rFonts w:ascii="Helvetica" w:hAnsi="Helvetica"/>
-          <w:color w:val="1E293B"/>
-          <w:sz w:val="17"/>
-        </w:rPr>
-        <w:t xml:space="preserve"> A 120-ball innings and a 6-over powerplay are assumed. Rain-shortened matches and other formats are not modelled, and the powerplay term assumes six powerplay overs per innings.</w:t>
+        <w:t xml:space="preserve">Squad continuity counts heads, not quality.</w:t>
+      </w:r>
+      <w:r>
+        <w:rPr>
+          <w:rFonts w:ascii="Helvetica" w:hAnsi="Helvetica"/>
+          <w:color w:val="1E293B"/>
+          <w:sz w:val="17"/>
+        </w:rPr>
+        <w:t xml:space="preserve"> Losing a leading wicket-taker weighs exactly the same as losing a fringe seamer. Weighting departures by what those players contributed would need per-player valuations, which is the judgement call the ordering is designed to exclude.</w:t>
       </w:r>
     </w:p>
     <w:p>
@@ -2575,6 +3194,37 @@
           <w:color w:val="0F172A"/>
           <w:sz w:val="17"/>
         </w:rPr>
+        <w:t xml:space="preserve">T20-shaped.</w:t>
+      </w:r>
+      <w:r>
+        <w:rPr>
+          <w:rFonts w:ascii="Helvetica" w:hAnsi="Helvetica"/>
+          <w:color w:val="1E293B"/>
+          <w:sz w:val="17"/>
+        </w:rPr>
+        <w:t xml:space="preserve"> A 120-ball innings and a 6-over powerplay are assumed. Rain-shortened matches and other formats are not modelled, and the powerplay term assumes six powerplay overs per innings.</w:t>
+      </w:r>
+    </w:p>
+    <w:p>
+      <w:pPr>
+        <w:spacing w:before="0" w:after="40" w:line="326" w:lineRule="auto"/>
+        <w:ind w:left="220" w:hanging="140"/>
+      </w:pPr>
+      <w:r>
+        <w:rPr>
+          <w:rFonts w:ascii="Helvetica" w:hAnsi="Helvetica"/>
+          <w:color w:val="1E293B"/>
+          <w:sz w:val="17"/>
+        </w:rPr>
+        <w:t xml:space="preserve">•  </w:t>
+      </w:r>
+      <w:r>
+        <w:rPr>
+          <w:rFonts w:ascii="Helvetica" w:hAnsi="Helvetica"/>
+          <w:b/>
+          <w:color w:val="0F172A"/>
+          <w:sz w:val="17"/>
+        </w:rPr>
         <w:t xml:space="preserve">Strength of schedule is inert in a balanced league.</w:t>
       </w:r>
       <w:r>
@@ -2584,6 +3234,71 @@
           <w:sz w:val="17"/>
         </w:rPr>
         <w:t xml:space="preserve"> By design it is identical for every team in a complete round robin; it only does work on an uneven schedule.</w:t>
+      </w:r>
+    </w:p>
+    <w:p>
+      <w:pPr>
+        <w:spacing w:before="0" w:after="40" w:line="326" w:lineRule="auto"/>
+        <w:ind w:left="220" w:hanging="140"/>
+      </w:pPr>
+      <w:r>
+        <w:rPr>
+          <w:rFonts w:ascii="Helvetica" w:hAnsi="Helvetica"/>
+          <w:color w:val="1E293B"/>
+          <w:sz w:val="17"/>
+        </w:rPr>
+        <w:t xml:space="preserve">•  </w:t>
+      </w:r>
+      <w:r>
+        <w:rPr>
+          <w:rFonts w:ascii="Helvetica" w:hAnsi="Helvetica"/>
+          <w:b/>
+          <w:color w:val="0F172A"/>
+          <w:sz w:val="17"/>
+        </w:rPr>
+        <w:t xml:space="preserve">The season carry-in is an assumption, not a measurement.</w:t>
+      </w:r>
+      <w:r>
+        <w:rPr>
+          <w:rFonts w:ascii="Helvetica" w:hAnsi="Helvetica"/>
+          <w:color w:val="1E293B"/>
+          <w:sz w:val="17"/>
+        </w:rPr>
+        <w:t xml:space="preserve"> Last season is evidence about this one, but it is not proof: squads change, and the 2025 phase terms are constants because no ball-by-ball source was available. The decay rate (</w:t>
+      </w:r>
+      <w:r>
+        <w:rPr>
+          <w:rFonts w:ascii="Consolas" w:hAnsi="Consolas"/>
+          <w:color w:val="1E293B"/>
+          <w:sz w:val="16"/>
+          <w:shd w:val="clear" w:fill="F1F5F9"/>
+        </w:rPr>
+        <w:t xml:space="preserve">prior.halfLifeMatches = 4</w:t>
+      </w:r>
+      <w:r>
+        <w:rPr>
+          <w:rFonts w:ascii="Helvetica" w:hAnsi="Helvetica"/>
+          <w:color w:val="1E293B"/>
+          <w:sz w:val="17"/>
+        </w:rPr>
+        <w:t xml:space="preserve">) and the expansion discount (</w:t>
+      </w:r>
+      <w:r>
+        <w:rPr>
+          <w:rFonts w:ascii="Consolas" w:hAnsi="Consolas"/>
+          <w:color w:val="1E293B"/>
+          <w:sz w:val="16"/>
+          <w:shd w:val="clear" w:fill="F1F5F9"/>
+        </w:rPr>
+        <w:t xml:space="preserve">prior.expansionSigma = 1.0</w:t>
+      </w:r>
+      <w:r>
+        <w:rPr>
+          <w:rFonts w:ascii="Helvetica" w:hAnsi="Helvetica"/>
+          <w:color w:val="1E293B"/>
+          <w:sz w:val="17"/>
+        </w:rPr>
+        <w:t xml:space="preserve">) are editorial settings, published here so they can be argued with, and both are switched off entirely by Fresh Start.</w:t>
       </w:r>
     </w:p>
     <w:p>

</xml_diff>